<commit_message>
feat: Add pending actions routes and controllers for various roles; enhance file naming conventions
</commit_message>
<xml_diff>
--- a/src/templates/template_kartu_konsultasi_outline.docx
+++ b/src/templates/template_kartu_konsultasi_outline.docx
@@ -171,282 +171,640 @@
     </w:p>
     <w:p>
       <w:pPr>
-        <w:spacing w:line="276" w:lineRule="auto"/>
-        <w:rPr>
-          <w:b/>
-          <w:bCs w:val="0"/>
-          <w:lang w:val="en-US"/>
-        </w:rPr>
-      </w:pPr>
-    </w:p>
-    <w:p>
-      <w:pPr>
         <w:tabs>
           <w:tab w:val="left" w:pos="3686"/>
           <w:tab w:val="left" w:pos="3828"/>
-          <w:tab w:val="center" w:leader="dot" w:pos="9639"/>
+          <w:tab w:val="center" w:leader="dot" w:pos="9630"/>
         </w:tabs>
         <w:spacing w:line="276" w:lineRule="auto"/>
-        <w:ind w:left="709"/>
         <w:rPr>
           <w:lang w:val="en-US"/>
         </w:rPr>
       </w:pPr>
-      <w:r>
-        <w:rPr>
-          <w:lang w:val="en-US"/>
-        </w:rPr>
-        <w:t xml:space="preserve">Nama </w:t>
-      </w:r>
-      <w:proofErr w:type="spellStart"/>
-      <w:r>
-        <w:rPr>
-          <w:lang w:val="en-US"/>
-        </w:rPr>
-        <w:t>Mahasiswa</w:t>
-      </w:r>
-      <w:proofErr w:type="spellEnd"/>
-      <w:r>
-        <w:rPr>
-          <w:lang w:val="en-US"/>
-        </w:rPr>
-        <w:tab/>
-        <w:t>:</w:t>
-      </w:r>
-      <w:r>
-        <w:rPr>
-          <w:lang w:val="en-US"/>
-        </w:rPr>
-        <w:tab/>
-      </w:r>
-      <w:r>
-        <w:rPr>
-          <w:lang w:val="en-US"/>
-        </w:rPr>
-        <w:t>{{</w:t>
-      </w:r>
-      <w:proofErr w:type="spellStart"/>
-      <w:r>
-        <w:rPr>
-          <w:lang w:val="en-US"/>
-        </w:rPr>
-        <w:t>nama_mahasiswa</w:t>
-      </w:r>
-      <w:proofErr w:type="spellEnd"/>
-      <w:r>
-        <w:rPr>
-          <w:lang w:val="en-US"/>
-        </w:rPr>
-        <w:t>}}</w:t>
-      </w:r>
     </w:p>
-    <w:p>
-      <w:pPr>
-        <w:tabs>
-          <w:tab w:val="left" w:pos="3686"/>
-          <w:tab w:val="left" w:pos="3828"/>
-          <w:tab w:val="center" w:leader="dot" w:pos="9639"/>
-        </w:tabs>
-        <w:spacing w:line="276" w:lineRule="auto"/>
-        <w:ind w:left="709"/>
-        <w:rPr>
-          <w:lang w:val="en-US"/>
-        </w:rPr>
-      </w:pPr>
-      <w:proofErr w:type="spellStart"/>
-      <w:r>
-        <w:rPr>
-          <w:lang w:val="en-US"/>
-        </w:rPr>
-        <w:t>Nomor</w:t>
-      </w:r>
-      <w:proofErr w:type="spellEnd"/>
-      <w:r>
-        <w:rPr>
-          <w:lang w:val="en-US"/>
-        </w:rPr>
-        <w:t xml:space="preserve"> </w:t>
-      </w:r>
-      <w:proofErr w:type="spellStart"/>
-      <w:r>
-        <w:rPr>
-          <w:lang w:val="en-US"/>
-        </w:rPr>
-        <w:t>Pokok</w:t>
-      </w:r>
-      <w:proofErr w:type="spellEnd"/>
-      <w:r>
-        <w:rPr>
-          <w:lang w:val="en-US"/>
-        </w:rPr>
-        <w:t xml:space="preserve"> </w:t>
-      </w:r>
-      <w:proofErr w:type="spellStart"/>
-      <w:r>
-        <w:rPr>
-          <w:lang w:val="en-US"/>
-        </w:rPr>
-        <w:t>Mahasiswa</w:t>
-      </w:r>
-      <w:proofErr w:type="spellEnd"/>
-      <w:r>
-        <w:rPr>
-          <w:lang w:val="en-US"/>
-        </w:rPr>
-        <w:tab/>
-        <w:t>:</w:t>
-      </w:r>
-      <w:r>
-        <w:rPr>
-          <w:lang w:val="en-US"/>
-        </w:rPr>
-        <w:tab/>
-      </w:r>
-      <w:r>
-        <w:rPr>
-          <w:lang w:val="en-US"/>
-        </w:rPr>
-        <w:t>{{</w:t>
-      </w:r>
-      <w:proofErr w:type="spellStart"/>
-      <w:r>
-        <w:rPr>
-          <w:lang w:val="en-US"/>
-        </w:rPr>
-        <w:t>npm</w:t>
-      </w:r>
-      <w:proofErr w:type="spellEnd"/>
-      <w:r>
-        <w:rPr>
-          <w:lang w:val="en-US"/>
-        </w:rPr>
-        <w:t>}}</w:t>
-      </w:r>
-    </w:p>
-    <w:p>
-      <w:pPr>
-        <w:tabs>
-          <w:tab w:val="left" w:pos="3686"/>
-          <w:tab w:val="left" w:pos="3828"/>
-          <w:tab w:val="center" w:leader="dot" w:pos="9639"/>
-        </w:tabs>
-        <w:spacing w:line="276" w:lineRule="auto"/>
-        <w:ind w:left="709"/>
-        <w:rPr>
-          <w:color w:val="EE0000"/>
-          <w:lang w:val="en-US"/>
-        </w:rPr>
-      </w:pPr>
-      <w:r>
-        <w:rPr>
-          <w:lang w:val="en-US"/>
-        </w:rPr>
-        <w:t>Program Studi</w:t>
-      </w:r>
-      <w:r>
-        <w:rPr>
-          <w:lang w:val="en-US"/>
-        </w:rPr>
-        <w:tab/>
-        <w:t xml:space="preserve">: </w:t>
-      </w:r>
-      <w:r>
-        <w:rPr>
-          <w:lang w:val="en-US"/>
-        </w:rPr>
-        <w:tab/>
-      </w:r>
-      <w:r>
-        <w:rPr>
-          <w:color w:val="EE0000"/>
-          <w:lang w:val="en-US"/>
-        </w:rPr>
-        <w:t>{{</w:t>
-      </w:r>
-      <w:proofErr w:type="spellStart"/>
-      <w:r>
-        <w:rPr>
-          <w:color w:val="EE0000"/>
-          <w:lang w:val="en-US"/>
-        </w:rPr>
-        <w:t>program_studi</w:t>
-      </w:r>
-      <w:proofErr w:type="spellEnd"/>
-      <w:r>
-        <w:rPr>
-          <w:color w:val="EE0000"/>
-          <w:lang w:val="en-US"/>
-        </w:rPr>
-        <w:t>}}</w:t>
-      </w:r>
-    </w:p>
-    <w:p>
-      <w:pPr>
-        <w:tabs>
-          <w:tab w:val="left" w:pos="3686"/>
-          <w:tab w:val="left" w:pos="3828"/>
-          <w:tab w:val="center" w:leader="dot" w:pos="9639"/>
-        </w:tabs>
-        <w:spacing w:line="276" w:lineRule="auto"/>
-        <w:ind w:left="709"/>
-        <w:rPr>
-          <w:lang w:val="en-US"/>
-        </w:rPr>
-      </w:pPr>
-      <w:proofErr w:type="spellStart"/>
-      <w:r>
-        <w:rPr>
-          <w:lang w:val="en-US"/>
-        </w:rPr>
-        <w:t>Judul</w:t>
-      </w:r>
-      <w:proofErr w:type="spellEnd"/>
-      <w:r>
-        <w:rPr>
-          <w:lang w:val="en-US"/>
-        </w:rPr>
-        <w:t xml:space="preserve"> </w:t>
-      </w:r>
-      <w:r>
-        <w:rPr>
-          <w:lang w:val="en-US"/>
-        </w:rPr>
-        <w:t>Skripsi</w:t>
-      </w:r>
-      <w:r>
-        <w:rPr>
-          <w:lang w:val="en-US"/>
-        </w:rPr>
-        <w:tab/>
-        <w:t>:</w:t>
-      </w:r>
-      <w:r>
-        <w:rPr>
-          <w:lang w:val="en-US"/>
-        </w:rPr>
-        <w:tab/>
-      </w:r>
-      <w:r>
-        <w:rPr>
-          <w:lang w:val="en-US"/>
-        </w:rPr>
-        <w:t>{{</w:t>
-      </w:r>
-      <w:proofErr w:type="spellStart"/>
-      <w:r>
-        <w:rPr>
-          <w:lang w:val="en-US"/>
-        </w:rPr>
-        <w:t>judul_skripsi</w:t>
-      </w:r>
-      <w:proofErr w:type="spellEnd"/>
-      <w:r>
-        <w:rPr>
-          <w:lang w:val="en-US"/>
-        </w:rPr>
-        <w:t>}}</w:t>
-      </w:r>
-    </w:p>
+    <w:tbl>
+      <w:tblPr>
+        <w:tblStyle w:val="TableGrid"/>
+        <w:tblW w:w="0" w:type="auto"/>
+        <w:tblInd w:w="709" w:type="dxa"/>
+        <w:tblBorders>
+          <w:top w:val="none" w:sz="0" w:space="0" w:color="auto"/>
+          <w:left w:val="none" w:sz="0" w:space="0" w:color="auto"/>
+          <w:bottom w:val="none" w:sz="0" w:space="0" w:color="auto"/>
+          <w:right w:val="none" w:sz="0" w:space="0" w:color="auto"/>
+          <w:insideH w:val="none" w:sz="0" w:space="0" w:color="auto"/>
+          <w:insideV w:val="none" w:sz="0" w:space="0" w:color="auto"/>
+        </w:tblBorders>
+        <w:tblLook w:val="04A0" w:firstRow="1" w:lastRow="0" w:firstColumn="1" w:lastColumn="0" w:noHBand="0" w:noVBand="1"/>
+      </w:tblPr>
+      <w:tblGrid>
+        <w:gridCol w:w="2830"/>
+        <w:gridCol w:w="284"/>
+        <w:gridCol w:w="6141"/>
+      </w:tblGrid>
+      <w:tr>
+        <w:tc>
+          <w:tcPr>
+            <w:tcW w:w="2830" w:type="dxa"/>
+          </w:tcPr>
+          <w:p>
+            <w:pPr>
+              <w:tabs>
+                <w:tab w:val="left" w:pos="25"/>
+                <w:tab w:val="left" w:pos="3686"/>
+                <w:tab w:val="left" w:pos="3828"/>
+                <w:tab w:val="center" w:leader="dot" w:pos="9630"/>
+              </w:tabs>
+              <w:spacing w:line="276" w:lineRule="auto"/>
+              <w:ind w:left="-113"/>
+              <w:rPr>
+                <w:lang w:val="en-US"/>
+              </w:rPr>
+            </w:pPr>
+            <w:r>
+              <w:rPr>
+                <w:lang w:val="en-US"/>
+              </w:rPr>
+              <w:t xml:space="preserve">Nama </w:t>
+            </w:r>
+            <w:proofErr w:type="spellStart"/>
+            <w:r>
+              <w:rPr>
+                <w:lang w:val="en-US"/>
+              </w:rPr>
+              <w:t>Mahasiswa</w:t>
+            </w:r>
+            <w:proofErr w:type="spellEnd"/>
+          </w:p>
+        </w:tc>
+        <w:tc>
+          <w:tcPr>
+            <w:tcW w:w="284" w:type="dxa"/>
+          </w:tcPr>
+          <w:p>
+            <w:pPr>
+              <w:tabs>
+                <w:tab w:val="left" w:pos="3686"/>
+                <w:tab w:val="left" w:pos="3828"/>
+                <w:tab w:val="center" w:leader="dot" w:pos="9630"/>
+              </w:tabs>
+              <w:spacing w:line="276" w:lineRule="auto"/>
+              <w:rPr>
+                <w:lang w:val="en-US"/>
+              </w:rPr>
+            </w:pPr>
+            <w:r>
+              <w:rPr>
+                <w:lang w:val="en-US"/>
+              </w:rPr>
+              <w:t>:</w:t>
+            </w:r>
+          </w:p>
+        </w:tc>
+        <w:tc>
+          <w:tcPr>
+            <w:tcW w:w="6141" w:type="dxa"/>
+          </w:tcPr>
+          <w:p>
+            <w:pPr>
+              <w:tabs>
+                <w:tab w:val="left" w:pos="3686"/>
+                <w:tab w:val="left" w:pos="3828"/>
+                <w:tab w:val="center" w:leader="dot" w:pos="9630"/>
+              </w:tabs>
+              <w:spacing w:line="276" w:lineRule="auto"/>
+              <w:rPr>
+                <w:lang w:val="en-US"/>
+              </w:rPr>
+            </w:pPr>
+            <w:r>
+              <w:rPr>
+                <w:lang w:val="en-US"/>
+              </w:rPr>
+              <w:t>{{</w:t>
+            </w:r>
+            <w:proofErr w:type="spellStart"/>
+            <w:r>
+              <w:rPr>
+                <w:lang w:val="en-US"/>
+              </w:rPr>
+              <w:t>nama_mahasiswa</w:t>
+            </w:r>
+            <w:proofErr w:type="spellEnd"/>
+            <w:r>
+              <w:rPr>
+                <w:lang w:val="en-US"/>
+              </w:rPr>
+              <w:t>}}</w:t>
+            </w:r>
+          </w:p>
+        </w:tc>
+      </w:tr>
+      <w:tr>
+        <w:tc>
+          <w:tcPr>
+            <w:tcW w:w="2830" w:type="dxa"/>
+          </w:tcPr>
+          <w:p>
+            <w:pPr>
+              <w:tabs>
+                <w:tab w:val="left" w:pos="25"/>
+                <w:tab w:val="left" w:pos="3686"/>
+                <w:tab w:val="left" w:pos="3828"/>
+                <w:tab w:val="center" w:leader="dot" w:pos="9630"/>
+              </w:tabs>
+              <w:spacing w:line="276" w:lineRule="auto"/>
+              <w:ind w:left="-113"/>
+              <w:rPr>
+                <w:lang w:val="en-US"/>
+              </w:rPr>
+            </w:pPr>
+            <w:proofErr w:type="spellStart"/>
+            <w:r>
+              <w:rPr>
+                <w:lang w:val="en-US"/>
+              </w:rPr>
+              <w:t>Nomor</w:t>
+            </w:r>
+            <w:proofErr w:type="spellEnd"/>
+            <w:r>
+              <w:rPr>
+                <w:lang w:val="en-US"/>
+              </w:rPr>
+              <w:t xml:space="preserve"> </w:t>
+            </w:r>
+            <w:proofErr w:type="spellStart"/>
+            <w:r>
+              <w:rPr>
+                <w:lang w:val="en-US"/>
+              </w:rPr>
+              <w:t>Pokok</w:t>
+            </w:r>
+            <w:proofErr w:type="spellEnd"/>
+            <w:r>
+              <w:rPr>
+                <w:lang w:val="en-US"/>
+              </w:rPr>
+              <w:t xml:space="preserve"> </w:t>
+            </w:r>
+            <w:proofErr w:type="spellStart"/>
+            <w:r>
+              <w:rPr>
+                <w:lang w:val="en-US"/>
+              </w:rPr>
+              <w:t>Mahasiswa</w:t>
+            </w:r>
+            <w:proofErr w:type="spellEnd"/>
+          </w:p>
+        </w:tc>
+        <w:tc>
+          <w:tcPr>
+            <w:tcW w:w="284" w:type="dxa"/>
+          </w:tcPr>
+          <w:p>
+            <w:pPr>
+              <w:tabs>
+                <w:tab w:val="left" w:pos="3686"/>
+                <w:tab w:val="left" w:pos="3828"/>
+                <w:tab w:val="center" w:leader="dot" w:pos="9630"/>
+              </w:tabs>
+              <w:spacing w:line="276" w:lineRule="auto"/>
+              <w:rPr>
+                <w:lang w:val="en-US"/>
+              </w:rPr>
+            </w:pPr>
+            <w:r>
+              <w:rPr>
+                <w:lang w:val="en-US"/>
+              </w:rPr>
+              <w:t>:</w:t>
+            </w:r>
+          </w:p>
+        </w:tc>
+        <w:tc>
+          <w:tcPr>
+            <w:tcW w:w="6141" w:type="dxa"/>
+          </w:tcPr>
+          <w:p>
+            <w:pPr>
+              <w:tabs>
+                <w:tab w:val="left" w:pos="3686"/>
+                <w:tab w:val="left" w:pos="3828"/>
+                <w:tab w:val="center" w:leader="dot" w:pos="9630"/>
+              </w:tabs>
+              <w:spacing w:line="276" w:lineRule="auto"/>
+              <w:rPr>
+                <w:lang w:val="en-US"/>
+              </w:rPr>
+            </w:pPr>
+            <w:r>
+              <w:rPr>
+                <w:lang w:val="en-US"/>
+              </w:rPr>
+              <w:t>{{</w:t>
+            </w:r>
+            <w:proofErr w:type="spellStart"/>
+            <w:r>
+              <w:rPr>
+                <w:lang w:val="en-US"/>
+              </w:rPr>
+              <w:t>npm</w:t>
+            </w:r>
+            <w:proofErr w:type="spellEnd"/>
+            <w:r>
+              <w:rPr>
+                <w:lang w:val="en-US"/>
+              </w:rPr>
+              <w:t>}}</w:t>
+            </w:r>
+          </w:p>
+        </w:tc>
+      </w:tr>
+      <w:tr>
+        <w:tc>
+          <w:tcPr>
+            <w:tcW w:w="2830" w:type="dxa"/>
+          </w:tcPr>
+          <w:p>
+            <w:pPr>
+              <w:tabs>
+                <w:tab w:val="left" w:pos="25"/>
+                <w:tab w:val="left" w:pos="3686"/>
+                <w:tab w:val="left" w:pos="3828"/>
+                <w:tab w:val="center" w:leader="dot" w:pos="9630"/>
+              </w:tabs>
+              <w:spacing w:line="276" w:lineRule="auto"/>
+              <w:ind w:left="-113"/>
+              <w:rPr>
+                <w:lang w:val="en-US"/>
+              </w:rPr>
+            </w:pPr>
+            <w:r>
+              <w:rPr>
+                <w:lang w:val="en-US"/>
+              </w:rPr>
+              <w:t>Program Studi</w:t>
+            </w:r>
+          </w:p>
+        </w:tc>
+        <w:tc>
+          <w:tcPr>
+            <w:tcW w:w="284" w:type="dxa"/>
+          </w:tcPr>
+          <w:p>
+            <w:pPr>
+              <w:tabs>
+                <w:tab w:val="left" w:pos="3686"/>
+                <w:tab w:val="left" w:pos="3828"/>
+                <w:tab w:val="center" w:leader="dot" w:pos="9630"/>
+              </w:tabs>
+              <w:spacing w:line="276" w:lineRule="auto"/>
+              <w:rPr>
+                <w:lang w:val="en-US"/>
+              </w:rPr>
+            </w:pPr>
+            <w:r>
+              <w:rPr>
+                <w:lang w:val="en-US"/>
+              </w:rPr>
+              <w:t>:</w:t>
+            </w:r>
+          </w:p>
+        </w:tc>
+        <w:tc>
+          <w:tcPr>
+            <w:tcW w:w="6141" w:type="dxa"/>
+          </w:tcPr>
+          <w:p>
+            <w:pPr>
+              <w:tabs>
+                <w:tab w:val="left" w:pos="3686"/>
+                <w:tab w:val="left" w:pos="3828"/>
+                <w:tab w:val="center" w:leader="dot" w:pos="9630"/>
+              </w:tabs>
+              <w:spacing w:line="276" w:lineRule="auto"/>
+              <w:rPr>
+                <w:lang w:val="en-US"/>
+              </w:rPr>
+            </w:pPr>
+            <w:r>
+              <w:rPr>
+                <w:lang w:val="en-US"/>
+              </w:rPr>
+              <w:t>{{</w:t>
+            </w:r>
+            <w:proofErr w:type="spellStart"/>
+            <w:r>
+              <w:rPr>
+                <w:lang w:val="en-US"/>
+              </w:rPr>
+              <w:t>program_studi</w:t>
+            </w:r>
+            <w:proofErr w:type="spellEnd"/>
+            <w:r>
+              <w:rPr>
+                <w:lang w:val="en-US"/>
+              </w:rPr>
+              <w:t>}}</w:t>
+            </w:r>
+          </w:p>
+        </w:tc>
+      </w:tr>
+      <w:tr>
+        <w:tc>
+          <w:tcPr>
+            <w:tcW w:w="2830" w:type="dxa"/>
+          </w:tcPr>
+          <w:p>
+            <w:pPr>
+              <w:tabs>
+                <w:tab w:val="left" w:pos="25"/>
+                <w:tab w:val="left" w:pos="3686"/>
+                <w:tab w:val="left" w:pos="3828"/>
+                <w:tab w:val="center" w:leader="dot" w:pos="9630"/>
+              </w:tabs>
+              <w:spacing w:line="276" w:lineRule="auto"/>
+              <w:ind w:left="-113"/>
+              <w:rPr>
+                <w:lang w:val="en-US"/>
+              </w:rPr>
+            </w:pPr>
+            <w:proofErr w:type="spellStart"/>
+            <w:r>
+              <w:rPr>
+                <w:lang w:val="en-US"/>
+              </w:rPr>
+              <w:t>Judul</w:t>
+            </w:r>
+            <w:proofErr w:type="spellEnd"/>
+            <w:r>
+              <w:rPr>
+                <w:lang w:val="en-US"/>
+              </w:rPr>
+              <w:t xml:space="preserve"> Skripsi</w:t>
+            </w:r>
+          </w:p>
+        </w:tc>
+        <w:tc>
+          <w:tcPr>
+            <w:tcW w:w="284" w:type="dxa"/>
+          </w:tcPr>
+          <w:p>
+            <w:pPr>
+              <w:tabs>
+                <w:tab w:val="left" w:pos="3686"/>
+                <w:tab w:val="left" w:pos="3828"/>
+                <w:tab w:val="center" w:leader="dot" w:pos="9630"/>
+              </w:tabs>
+              <w:spacing w:line="276" w:lineRule="auto"/>
+              <w:rPr>
+                <w:lang w:val="en-US"/>
+              </w:rPr>
+            </w:pPr>
+            <w:r>
+              <w:rPr>
+                <w:lang w:val="en-US"/>
+              </w:rPr>
+              <w:t>:</w:t>
+            </w:r>
+          </w:p>
+        </w:tc>
+        <w:tc>
+          <w:tcPr>
+            <w:tcW w:w="6141" w:type="dxa"/>
+          </w:tcPr>
+          <w:p>
+            <w:pPr>
+              <w:tabs>
+                <w:tab w:val="left" w:pos="3686"/>
+                <w:tab w:val="left" w:pos="3828"/>
+                <w:tab w:val="center" w:leader="dot" w:pos="9630"/>
+              </w:tabs>
+              <w:spacing w:line="276" w:lineRule="auto"/>
+              <w:rPr>
+                <w:lang w:val="en-US"/>
+              </w:rPr>
+            </w:pPr>
+            <w:r>
+              <w:rPr>
+                <w:lang w:val="en-US"/>
+              </w:rPr>
+              <w:t>{{</w:t>
+            </w:r>
+            <w:proofErr w:type="spellStart"/>
+            <w:r>
+              <w:rPr>
+                <w:lang w:val="en-US"/>
+              </w:rPr>
+              <w:t>judul_skripsi</w:t>
+            </w:r>
+            <w:proofErr w:type="spellEnd"/>
+            <w:r>
+              <w:rPr>
+                <w:lang w:val="en-US"/>
+              </w:rPr>
+              <w:t>}}</w:t>
+            </w:r>
+          </w:p>
+        </w:tc>
+      </w:tr>
+      <w:tr>
+        <w:tc>
+          <w:tcPr>
+            <w:tcW w:w="2830" w:type="dxa"/>
+          </w:tcPr>
+          <w:p>
+            <w:pPr>
+              <w:tabs>
+                <w:tab w:val="left" w:pos="25"/>
+                <w:tab w:val="left" w:pos="3686"/>
+                <w:tab w:val="left" w:pos="3828"/>
+                <w:tab w:val="center" w:leader="dot" w:pos="9630"/>
+              </w:tabs>
+              <w:spacing w:line="276" w:lineRule="auto"/>
+              <w:ind w:left="-113"/>
+              <w:rPr>
+                <w:lang w:val="en-US"/>
+              </w:rPr>
+            </w:pPr>
+            <w:r>
+              <w:rPr>
+                <w:lang w:val="en-US"/>
+              </w:rPr>
+              <w:t xml:space="preserve">Dosen </w:t>
+            </w:r>
+            <w:proofErr w:type="spellStart"/>
+            <w:r>
+              <w:rPr>
+                <w:lang w:val="en-US"/>
+              </w:rPr>
+              <w:t>Pembimbing</w:t>
+            </w:r>
+            <w:proofErr w:type="spellEnd"/>
+            <w:r>
+              <w:rPr>
+                <w:lang w:val="en-US"/>
+              </w:rPr>
+              <w:t xml:space="preserve"> </w:t>
+            </w:r>
+            <w:proofErr w:type="spellStart"/>
+            <w:r>
+              <w:rPr>
+                <w:lang w:val="en-US"/>
+              </w:rPr>
+              <w:t>Pertama</w:t>
+            </w:r>
+            <w:proofErr w:type="spellEnd"/>
+          </w:p>
+        </w:tc>
+        <w:tc>
+          <w:tcPr>
+            <w:tcW w:w="284" w:type="dxa"/>
+          </w:tcPr>
+          <w:p>
+            <w:pPr>
+              <w:tabs>
+                <w:tab w:val="left" w:pos="3686"/>
+                <w:tab w:val="left" w:pos="3828"/>
+                <w:tab w:val="center" w:leader="dot" w:pos="9630"/>
+              </w:tabs>
+              <w:spacing w:line="276" w:lineRule="auto"/>
+              <w:rPr>
+                <w:lang w:val="en-US"/>
+              </w:rPr>
+            </w:pPr>
+            <w:r>
+              <w:rPr>
+                <w:lang w:val="en-US"/>
+              </w:rPr>
+              <w:t>:</w:t>
+            </w:r>
+          </w:p>
+        </w:tc>
+        <w:tc>
+          <w:tcPr>
+            <w:tcW w:w="6141" w:type="dxa"/>
+          </w:tcPr>
+          <w:p>
+            <w:pPr>
+              <w:tabs>
+                <w:tab w:val="left" w:pos="3686"/>
+                <w:tab w:val="left" w:pos="3828"/>
+                <w:tab w:val="center" w:leader="dot" w:pos="9630"/>
+              </w:tabs>
+              <w:spacing w:line="276" w:lineRule="auto"/>
+              <w:rPr>
+                <w:lang w:val="en-US"/>
+              </w:rPr>
+            </w:pPr>
+            <w:r>
+              <w:rPr>
+                <w:lang w:val="en-US"/>
+              </w:rPr>
+              <w:t>{{pembimbing1}}</w:t>
+            </w:r>
+          </w:p>
+        </w:tc>
+      </w:tr>
+      <w:tr>
+        <w:tc>
+          <w:tcPr>
+            <w:tcW w:w="2830" w:type="dxa"/>
+          </w:tcPr>
+          <w:p>
+            <w:pPr>
+              <w:tabs>
+                <w:tab w:val="left" w:pos="25"/>
+                <w:tab w:val="left" w:pos="3686"/>
+                <w:tab w:val="left" w:pos="3828"/>
+                <w:tab w:val="center" w:leader="dot" w:pos="9630"/>
+              </w:tabs>
+              <w:spacing w:line="276" w:lineRule="auto"/>
+              <w:ind w:left="-113"/>
+              <w:rPr>
+                <w:lang w:val="en-US"/>
+              </w:rPr>
+            </w:pPr>
+            <w:r>
+              <w:rPr>
+                <w:lang w:val="en-US"/>
+              </w:rPr>
+              <w:t xml:space="preserve">Dosen </w:t>
+            </w:r>
+            <w:proofErr w:type="spellStart"/>
+            <w:r>
+              <w:rPr>
+                <w:lang w:val="en-US"/>
+              </w:rPr>
+              <w:t>Pembimbing</w:t>
+            </w:r>
+            <w:proofErr w:type="spellEnd"/>
+            <w:r>
+              <w:rPr>
+                <w:lang w:val="en-US"/>
+              </w:rPr>
+              <w:t xml:space="preserve"> </w:t>
+            </w:r>
+            <w:proofErr w:type="spellStart"/>
+            <w:r>
+              <w:rPr>
+                <w:lang w:val="en-US"/>
+              </w:rPr>
+              <w:t>Kedua</w:t>
+            </w:r>
+            <w:proofErr w:type="spellEnd"/>
+          </w:p>
+        </w:tc>
+        <w:tc>
+          <w:tcPr>
+            <w:tcW w:w="284" w:type="dxa"/>
+          </w:tcPr>
+          <w:p>
+            <w:pPr>
+              <w:tabs>
+                <w:tab w:val="left" w:pos="3686"/>
+                <w:tab w:val="left" w:pos="3828"/>
+                <w:tab w:val="center" w:leader="dot" w:pos="9630"/>
+              </w:tabs>
+              <w:spacing w:line="276" w:lineRule="auto"/>
+              <w:rPr>
+                <w:lang w:val="en-US"/>
+              </w:rPr>
+            </w:pPr>
+            <w:r>
+              <w:rPr>
+                <w:lang w:val="en-US"/>
+              </w:rPr>
+              <w:t>:</w:t>
+            </w:r>
+          </w:p>
+        </w:tc>
+        <w:tc>
+          <w:tcPr>
+            <w:tcW w:w="6141" w:type="dxa"/>
+          </w:tcPr>
+          <w:p>
+            <w:pPr>
+              <w:tabs>
+                <w:tab w:val="left" w:pos="3686"/>
+                <w:tab w:val="left" w:pos="3828"/>
+                <w:tab w:val="center" w:leader="dot" w:pos="9630"/>
+              </w:tabs>
+              <w:spacing w:line="276" w:lineRule="auto"/>
+              <w:rPr>
+                <w:lang w:val="en-US"/>
+              </w:rPr>
+            </w:pPr>
+            <w:r>
+              <w:rPr>
+                <w:lang w:val="en-US"/>
+              </w:rPr>
+              <w:t>{{pembimbing2}}</w:t>
+            </w:r>
+          </w:p>
+        </w:tc>
+      </w:tr>
+    </w:tbl>
     <w:p>
       <w:pPr>
         <w:tabs>
@@ -460,120 +818,6 @@
           <w:lang w:val="en-US"/>
         </w:rPr>
       </w:pPr>
-      <w:r>
-        <w:rPr>
-          <w:lang w:val="en-US"/>
-        </w:rPr>
-        <w:t xml:space="preserve">Dosen </w:t>
-      </w:r>
-      <w:proofErr w:type="spellStart"/>
-      <w:r>
-        <w:rPr>
-          <w:lang w:val="en-US"/>
-        </w:rPr>
-        <w:t>Pembimbing</w:t>
-      </w:r>
-      <w:proofErr w:type="spellEnd"/>
-      <w:r>
-        <w:rPr>
-          <w:lang w:val="en-US"/>
-        </w:rPr>
-        <w:t xml:space="preserve"> </w:t>
-      </w:r>
-      <w:proofErr w:type="spellStart"/>
-      <w:r>
-        <w:rPr>
-          <w:lang w:val="en-US"/>
-        </w:rPr>
-        <w:t>Pertama</w:t>
-      </w:r>
-      <w:proofErr w:type="spellEnd"/>
-      <w:r>
-        <w:rPr>
-          <w:lang w:val="en-US"/>
-        </w:rPr>
-        <w:tab/>
-        <w:t>:</w:t>
-      </w:r>
-      <w:r>
-        <w:rPr>
-          <w:lang w:val="en-US"/>
-        </w:rPr>
-        <w:tab/>
-      </w:r>
-      <w:r>
-        <w:rPr>
-          <w:lang w:val="en-US"/>
-        </w:rPr>
-        <w:t>{{pembimbing1}}</w:t>
-      </w:r>
-    </w:p>
-    <w:p>
-      <w:pPr>
-        <w:tabs>
-          <w:tab w:val="left" w:pos="3686"/>
-          <w:tab w:val="left" w:pos="3828"/>
-          <w:tab w:val="center" w:leader="dot" w:pos="9630"/>
-        </w:tabs>
-        <w:spacing w:line="276" w:lineRule="auto"/>
-        <w:ind w:left="709"/>
-        <w:rPr>
-          <w:lang w:val="en-US"/>
-        </w:rPr>
-      </w:pPr>
-      <w:r>
-        <w:rPr>
-          <w:lang w:val="en-US"/>
-        </w:rPr>
-        <w:t xml:space="preserve">Dosen </w:t>
-      </w:r>
-      <w:proofErr w:type="spellStart"/>
-      <w:r>
-        <w:rPr>
-          <w:lang w:val="en-US"/>
-        </w:rPr>
-        <w:t>Pembimbing</w:t>
-      </w:r>
-      <w:proofErr w:type="spellEnd"/>
-      <w:r>
-        <w:rPr>
-          <w:lang w:val="en-US"/>
-        </w:rPr>
-        <w:t xml:space="preserve"> </w:t>
-      </w:r>
-      <w:proofErr w:type="spellStart"/>
-      <w:r>
-        <w:rPr>
-          <w:lang w:val="en-US"/>
-        </w:rPr>
-        <w:t>K</w:t>
-      </w:r>
-      <w:r>
-        <w:rPr>
-          <w:lang w:val="en-US"/>
-        </w:rPr>
-        <w:t>edua</w:t>
-      </w:r>
-      <w:proofErr w:type="spellEnd"/>
-      <w:r>
-        <w:rPr>
-          <w:lang w:val="en-US"/>
-        </w:rPr>
-        <w:tab/>
-        <w:t>:</w:t>
-      </w:r>
-      <w:r>
-        <w:rPr>
-          <w:lang w:val="en-US"/>
-        </w:rPr>
-        <w:tab/>
-      </w:r>
-      <w:r>
-        <w:rPr>
-          <w:lang w:val="en-US"/>
-        </w:rPr>
-        <w:t>{{pembimbing2}}</w:t>
-      </w:r>
     </w:p>
     <w:p>
       <w:pPr>
@@ -1289,19 +1533,7 @@
               <w:rPr>
                 <w:lang w:val="en-US"/>
               </w:rPr>
-              <w:t>{{</w:t>
-            </w:r>
-            <w:r>
-              <w:rPr>
-                <w:lang w:val="en-US"/>
-              </w:rPr>
-              <w:t>keterangan_1</w:t>
-            </w:r>
-            <w:r>
-              <w:rPr>
-                <w:lang w:val="en-US"/>
-              </w:rPr>
-              <w:t>}}</w:t>
+              <w:t>{{keterangan_1}}</w:t>
             </w:r>
           </w:p>
         </w:tc>
@@ -1346,19 +1578,7 @@
               <w:rPr>
                 <w:lang w:val="en-US"/>
               </w:rPr>
-              <w:t>{{tanggal_</w:t>
-            </w:r>
-            <w:r>
-              <w:rPr>
-                <w:lang w:val="en-US"/>
-              </w:rPr>
-              <w:t>2</w:t>
-            </w:r>
-            <w:r>
-              <w:rPr>
-                <w:lang w:val="en-US"/>
-              </w:rPr>
-              <w:t>}}</w:t>
+              <w:t>{{tanggal_2}}</w:t>
             </w:r>
           </w:p>
         </w:tc>
@@ -1378,19 +1598,7 @@
               <w:rPr>
                 <w:lang w:val="en-US"/>
               </w:rPr>
-              <w:t>{{keterangan_</w:t>
-            </w:r>
-            <w:r>
-              <w:rPr>
-                <w:lang w:val="en-US"/>
-              </w:rPr>
-              <w:t>2</w:t>
-            </w:r>
-            <w:r>
-              <w:rPr>
-                <w:lang w:val="en-US"/>
-              </w:rPr>
-              <w:t>}}</w:t>
+              <w:t>{{keterangan_2}}</w:t>
             </w:r>
           </w:p>
         </w:tc>
@@ -1410,19 +1618,7 @@
               <w:rPr>
                 <w:lang w:val="en-US"/>
               </w:rPr>
-              <w:t>{{paraf_</w:t>
-            </w:r>
-            <w:r>
-              <w:rPr>
-                <w:lang w:val="en-US"/>
-              </w:rPr>
-              <w:t>2</w:t>
-            </w:r>
-            <w:r>
-              <w:rPr>
-                <w:lang w:val="en-US"/>
-              </w:rPr>
-              <w:t>}}</w:t>
+              <w:t>{{paraf_2}}</w:t>
             </w:r>
           </w:p>
         </w:tc>
@@ -1447,19 +1643,7 @@
               <w:rPr>
                 <w:lang w:val="en-US"/>
               </w:rPr>
-              <w:t>{{tanggal_</w:t>
-            </w:r>
-            <w:r>
-              <w:rPr>
-                <w:lang w:val="en-US"/>
-              </w:rPr>
-              <w:t>3</w:t>
-            </w:r>
-            <w:r>
-              <w:rPr>
-                <w:lang w:val="en-US"/>
-              </w:rPr>
-              <w:t>}}</w:t>
+              <w:t>{{tanggal_3}}</w:t>
             </w:r>
           </w:p>
         </w:tc>
@@ -1479,19 +1663,7 @@
               <w:rPr>
                 <w:lang w:val="en-US"/>
               </w:rPr>
-              <w:t>{{keterangan_</w:t>
-            </w:r>
-            <w:r>
-              <w:rPr>
-                <w:lang w:val="en-US"/>
-              </w:rPr>
-              <w:t>3</w:t>
-            </w:r>
-            <w:r>
-              <w:rPr>
-                <w:lang w:val="en-US"/>
-              </w:rPr>
-              <w:t>}}</w:t>
+              <w:t>{{keterangan_3}}</w:t>
             </w:r>
           </w:p>
         </w:tc>
@@ -1511,19 +1683,7 @@
               <w:rPr>
                 <w:lang w:val="en-US"/>
               </w:rPr>
-              <w:t>{{paraf_</w:t>
-            </w:r>
-            <w:r>
-              <w:rPr>
-                <w:lang w:val="en-US"/>
-              </w:rPr>
-              <w:t>3</w:t>
-            </w:r>
-            <w:r>
-              <w:rPr>
-                <w:lang w:val="en-US"/>
-              </w:rPr>
-              <w:t>}}</w:t>
+              <w:t>{{paraf_3}}</w:t>
             </w:r>
           </w:p>
         </w:tc>
@@ -1548,19 +1708,7 @@
               <w:rPr>
                 <w:lang w:val="en-US"/>
               </w:rPr>
-              <w:t>{{tanggal_</w:t>
-            </w:r>
-            <w:r>
-              <w:rPr>
-                <w:lang w:val="en-US"/>
-              </w:rPr>
-              <w:t>4</w:t>
-            </w:r>
-            <w:r>
-              <w:rPr>
-                <w:lang w:val="en-US"/>
-              </w:rPr>
-              <w:t>}}</w:t>
+              <w:t>{{tanggal_4}}</w:t>
             </w:r>
           </w:p>
         </w:tc>
@@ -1580,19 +1728,7 @@
               <w:rPr>
                 <w:lang w:val="en-US"/>
               </w:rPr>
-              <w:t>{{keterangan_</w:t>
-            </w:r>
-            <w:r>
-              <w:rPr>
-                <w:lang w:val="en-US"/>
-              </w:rPr>
-              <w:t>4</w:t>
-            </w:r>
-            <w:r>
-              <w:rPr>
-                <w:lang w:val="en-US"/>
-              </w:rPr>
-              <w:t>}}</w:t>
+              <w:t>{{keterangan_4}}</w:t>
             </w:r>
           </w:p>
         </w:tc>
@@ -1612,19 +1748,7 @@
               <w:rPr>
                 <w:lang w:val="en-US"/>
               </w:rPr>
-              <w:t>{{paraf_</w:t>
-            </w:r>
-            <w:r>
-              <w:rPr>
-                <w:lang w:val="en-US"/>
-              </w:rPr>
-              <w:t>4</w:t>
-            </w:r>
-            <w:r>
-              <w:rPr>
-                <w:lang w:val="en-US"/>
-              </w:rPr>
-              <w:t>}}</w:t>
+              <w:t>{{paraf_4}}</w:t>
             </w:r>
           </w:p>
         </w:tc>
@@ -1649,19 +1773,7 @@
               <w:rPr>
                 <w:lang w:val="en-US"/>
               </w:rPr>
-              <w:t>{{tanggal_</w:t>
-            </w:r>
-            <w:r>
-              <w:rPr>
-                <w:lang w:val="en-US"/>
-              </w:rPr>
-              <w:t>5</w:t>
-            </w:r>
-            <w:r>
-              <w:rPr>
-                <w:lang w:val="en-US"/>
-              </w:rPr>
-              <w:t>}}</w:t>
+              <w:t>{{tanggal_5}}</w:t>
             </w:r>
           </w:p>
         </w:tc>
@@ -1681,19 +1793,7 @@
               <w:rPr>
                 <w:lang w:val="en-US"/>
               </w:rPr>
-              <w:t>{{keterangan_</w:t>
-            </w:r>
-            <w:r>
-              <w:rPr>
-                <w:lang w:val="en-US"/>
-              </w:rPr>
-              <w:t>5</w:t>
-            </w:r>
-            <w:r>
-              <w:rPr>
-                <w:lang w:val="en-US"/>
-              </w:rPr>
-              <w:t>}}</w:t>
+              <w:t>{{keterangan_5}}</w:t>
             </w:r>
           </w:p>
         </w:tc>
@@ -1713,19 +1813,7 @@
               <w:rPr>
                 <w:lang w:val="en-US"/>
               </w:rPr>
-              <w:t>{{paraf_</w:t>
-            </w:r>
-            <w:r>
-              <w:rPr>
-                <w:lang w:val="en-US"/>
-              </w:rPr>
-              <w:t>5</w:t>
-            </w:r>
-            <w:r>
-              <w:rPr>
-                <w:lang w:val="en-US"/>
-              </w:rPr>
-              <w:t>}}</w:t>
+              <w:t>{{paraf_5}}</w:t>
             </w:r>
           </w:p>
         </w:tc>
@@ -1750,19 +1838,7 @@
               <w:rPr>
                 <w:lang w:val="en-US"/>
               </w:rPr>
-              <w:t>{{tanggal_</w:t>
-            </w:r>
-            <w:r>
-              <w:rPr>
-                <w:lang w:val="en-US"/>
-              </w:rPr>
-              <w:t>6</w:t>
-            </w:r>
-            <w:r>
-              <w:rPr>
-                <w:lang w:val="en-US"/>
-              </w:rPr>
-              <w:t>}}</w:t>
+              <w:t>{{tanggal_6}}</w:t>
             </w:r>
           </w:p>
         </w:tc>
@@ -1782,19 +1858,7 @@
               <w:rPr>
                 <w:lang w:val="en-US"/>
               </w:rPr>
-              <w:t>{{keterangan_</w:t>
-            </w:r>
-            <w:r>
-              <w:rPr>
-                <w:lang w:val="en-US"/>
-              </w:rPr>
-              <w:t>6</w:t>
-            </w:r>
-            <w:r>
-              <w:rPr>
-                <w:lang w:val="en-US"/>
-              </w:rPr>
-              <w:t>}}</w:t>
+              <w:t>{{keterangan_6}}</w:t>
             </w:r>
           </w:p>
         </w:tc>
@@ -1814,19 +1878,7 @@
               <w:rPr>
                 <w:lang w:val="en-US"/>
               </w:rPr>
-              <w:t>{{paraf</w:t>
-            </w:r>
-            <w:r>
-              <w:rPr>
-                <w:lang w:val="en-US"/>
-              </w:rPr>
-              <w:t>_6</w:t>
-            </w:r>
-            <w:r>
-              <w:rPr>
-                <w:lang w:val="en-US"/>
-              </w:rPr>
-              <w:t>}}</w:t>
+              <w:t>{{paraf_6}}</w:t>
             </w:r>
           </w:p>
         </w:tc>
@@ -1851,19 +1903,7 @@
               <w:rPr>
                 <w:lang w:val="en-US"/>
               </w:rPr>
-              <w:t>{{tanggal_</w:t>
-            </w:r>
-            <w:r>
-              <w:rPr>
-                <w:lang w:val="en-US"/>
-              </w:rPr>
-              <w:t>7</w:t>
-            </w:r>
-            <w:r>
-              <w:rPr>
-                <w:lang w:val="en-US"/>
-              </w:rPr>
-              <w:t>}}</w:t>
+              <w:t>{{tanggal_7}}</w:t>
             </w:r>
           </w:p>
         </w:tc>
@@ -1883,19 +1923,7 @@
               <w:rPr>
                 <w:lang w:val="en-US"/>
               </w:rPr>
-              <w:t>{{keterangan_</w:t>
-            </w:r>
-            <w:r>
-              <w:rPr>
-                <w:lang w:val="en-US"/>
-              </w:rPr>
-              <w:t>7</w:t>
-            </w:r>
-            <w:r>
-              <w:rPr>
-                <w:lang w:val="en-US"/>
-              </w:rPr>
-              <w:t>}}</w:t>
+              <w:t>{{keterangan_7}}</w:t>
             </w:r>
           </w:p>
         </w:tc>
@@ -1915,19 +1943,7 @@
               <w:rPr>
                 <w:lang w:val="en-US"/>
               </w:rPr>
-              <w:t>{{paraf_</w:t>
-            </w:r>
-            <w:r>
-              <w:rPr>
-                <w:lang w:val="en-US"/>
-              </w:rPr>
-              <w:t>7</w:t>
-            </w:r>
-            <w:r>
-              <w:rPr>
-                <w:lang w:val="en-US"/>
-              </w:rPr>
-              <w:t>}}</w:t>
+              <w:t>{{paraf_7}}</w:t>
             </w:r>
           </w:p>
         </w:tc>
@@ -1952,19 +1968,7 @@
               <w:rPr>
                 <w:lang w:val="en-US"/>
               </w:rPr>
-              <w:t>{{tanggal_</w:t>
-            </w:r>
-            <w:r>
-              <w:rPr>
-                <w:lang w:val="en-US"/>
-              </w:rPr>
-              <w:t>8</w:t>
-            </w:r>
-            <w:r>
-              <w:rPr>
-                <w:lang w:val="en-US"/>
-              </w:rPr>
-              <w:t>}}</w:t>
+              <w:t>{{tanggal_8}}</w:t>
             </w:r>
           </w:p>
         </w:tc>
@@ -1984,19 +1988,7 @@
               <w:rPr>
                 <w:lang w:val="en-US"/>
               </w:rPr>
-              <w:t>{{keterangan_</w:t>
-            </w:r>
-            <w:r>
-              <w:rPr>
-                <w:lang w:val="en-US"/>
-              </w:rPr>
-              <w:t>8</w:t>
-            </w:r>
-            <w:r>
-              <w:rPr>
-                <w:lang w:val="en-US"/>
-              </w:rPr>
-              <w:t>}}</w:t>
+              <w:t>{{keterangan_8}}</w:t>
             </w:r>
           </w:p>
         </w:tc>
@@ -2016,19 +2008,7 @@
               <w:rPr>
                 <w:lang w:val="en-US"/>
               </w:rPr>
-              <w:t>{{paraf_</w:t>
-            </w:r>
-            <w:r>
-              <w:rPr>
-                <w:lang w:val="en-US"/>
-              </w:rPr>
-              <w:t>8</w:t>
-            </w:r>
-            <w:r>
-              <w:rPr>
-                <w:lang w:val="en-US"/>
-              </w:rPr>
-              <w:t>}}</w:t>
+              <w:t>{{paraf_8}}</w:t>
             </w:r>
           </w:p>
         </w:tc>
@@ -2053,19 +2033,7 @@
               <w:rPr>
                 <w:lang w:val="en-US"/>
               </w:rPr>
-              <w:t>{{tanggal_</w:t>
-            </w:r>
-            <w:r>
-              <w:rPr>
-                <w:lang w:val="en-US"/>
-              </w:rPr>
-              <w:t>9</w:t>
-            </w:r>
-            <w:r>
-              <w:rPr>
-                <w:lang w:val="en-US"/>
-              </w:rPr>
-              <w:t>}}</w:t>
+              <w:t>{{tanggal_9}}</w:t>
             </w:r>
           </w:p>
         </w:tc>
@@ -2085,19 +2053,7 @@
               <w:rPr>
                 <w:lang w:val="en-US"/>
               </w:rPr>
-              <w:t>{{keterangan_</w:t>
-            </w:r>
-            <w:r>
-              <w:rPr>
-                <w:lang w:val="en-US"/>
-              </w:rPr>
-              <w:t>9</w:t>
-            </w:r>
-            <w:r>
-              <w:rPr>
-                <w:lang w:val="en-US"/>
-              </w:rPr>
-              <w:t>}}</w:t>
+              <w:t>{{keterangan_9}}</w:t>
             </w:r>
           </w:p>
         </w:tc>
@@ -2117,19 +2073,7 @@
               <w:rPr>
                 <w:lang w:val="en-US"/>
               </w:rPr>
-              <w:t>{{paraf_</w:t>
-            </w:r>
-            <w:r>
-              <w:rPr>
-                <w:lang w:val="en-US"/>
-              </w:rPr>
-              <w:t>9</w:t>
-            </w:r>
-            <w:r>
-              <w:rPr>
-                <w:lang w:val="en-US"/>
-              </w:rPr>
-              <w:t>}}</w:t>
+              <w:t>{{paraf_9}}</w:t>
             </w:r>
           </w:p>
         </w:tc>
@@ -2174,19 +2118,7 @@
               <w:rPr>
                 <w:lang w:val="en-US"/>
               </w:rPr>
-              <w:t>{{keterangan_1</w:t>
-            </w:r>
-            <w:r>
-              <w:rPr>
-                <w:lang w:val="en-US"/>
-              </w:rPr>
-              <w:t>0</w:t>
-            </w:r>
-            <w:r>
-              <w:rPr>
-                <w:lang w:val="en-US"/>
-              </w:rPr>
-              <w:t>}}</w:t>
+              <w:t>{{keterangan_10}}</w:t>
             </w:r>
           </w:p>
         </w:tc>
@@ -2206,19 +2138,7 @@
               <w:rPr>
                 <w:lang w:val="en-US"/>
               </w:rPr>
-              <w:t>{{paraf_</w:t>
-            </w:r>
-            <w:r>
-              <w:rPr>
-                <w:lang w:val="en-US"/>
-              </w:rPr>
-              <w:t>10</w:t>
-            </w:r>
-            <w:r>
-              <w:rPr>
-                <w:lang w:val="en-US"/>
-              </w:rPr>
-              <w:t>}}</w:t>
+              <w:t>{{paraf_10}}</w:t>
             </w:r>
           </w:p>
         </w:tc>
@@ -2243,19 +2163,7 @@
               <w:rPr>
                 <w:lang w:val="en-US"/>
               </w:rPr>
-              <w:t>{{tanggal_1</w:t>
-            </w:r>
-            <w:r>
-              <w:rPr>
-                <w:lang w:val="en-US"/>
-              </w:rPr>
-              <w:t>1</w:t>
-            </w:r>
-            <w:r>
-              <w:rPr>
-                <w:lang w:val="en-US"/>
-              </w:rPr>
-              <w:t>}}</w:t>
+              <w:t>{{tanggal_11}}</w:t>
             </w:r>
           </w:p>
         </w:tc>
@@ -2275,19 +2183,7 @@
               <w:rPr>
                 <w:lang w:val="en-US"/>
               </w:rPr>
-              <w:t>{{keterangan_1</w:t>
-            </w:r>
-            <w:r>
-              <w:rPr>
-                <w:lang w:val="en-US"/>
-              </w:rPr>
-              <w:t>1</w:t>
-            </w:r>
-            <w:r>
-              <w:rPr>
-                <w:lang w:val="en-US"/>
-              </w:rPr>
-              <w:t>}}</w:t>
+              <w:t>{{keterangan_11}}</w:t>
             </w:r>
           </w:p>
         </w:tc>
@@ -2307,19 +2203,7 @@
               <w:rPr>
                 <w:lang w:val="en-US"/>
               </w:rPr>
-              <w:t>{{paraf_1</w:t>
-            </w:r>
-            <w:r>
-              <w:rPr>
-                <w:lang w:val="en-US"/>
-              </w:rPr>
-              <w:t>1</w:t>
-            </w:r>
-            <w:r>
-              <w:rPr>
-                <w:lang w:val="en-US"/>
-              </w:rPr>
-              <w:t>}}</w:t>
+              <w:t>{{paraf_11}}</w:t>
             </w:r>
           </w:p>
         </w:tc>
@@ -2344,19 +2228,7 @@
               <w:rPr>
                 <w:lang w:val="en-US"/>
               </w:rPr>
-              <w:t>{{tanggal_1</w:t>
-            </w:r>
-            <w:r>
-              <w:rPr>
-                <w:lang w:val="en-US"/>
-              </w:rPr>
-              <w:t>2</w:t>
-            </w:r>
-            <w:r>
-              <w:rPr>
-                <w:lang w:val="en-US"/>
-              </w:rPr>
-              <w:t>}}</w:t>
+              <w:t>{{tanggal_12}}</w:t>
             </w:r>
           </w:p>
         </w:tc>
@@ -2376,19 +2248,7 @@
               <w:rPr>
                 <w:lang w:val="en-US"/>
               </w:rPr>
-              <w:t>{{keterangan_1</w:t>
-            </w:r>
-            <w:r>
-              <w:rPr>
-                <w:lang w:val="en-US"/>
-              </w:rPr>
-              <w:t>2</w:t>
-            </w:r>
-            <w:r>
-              <w:rPr>
-                <w:lang w:val="en-US"/>
-              </w:rPr>
-              <w:t>}}</w:t>
+              <w:t>{{keterangan_12}}</w:t>
             </w:r>
           </w:p>
         </w:tc>
@@ -2408,19 +2268,7 @@
               <w:rPr>
                 <w:lang w:val="en-US"/>
               </w:rPr>
-              <w:t>{{paraf_1</w:t>
-            </w:r>
-            <w:r>
-              <w:rPr>
-                <w:lang w:val="en-US"/>
-              </w:rPr>
-              <w:t>2</w:t>
-            </w:r>
-            <w:r>
-              <w:rPr>
-                <w:lang w:val="en-US"/>
-              </w:rPr>
-              <w:t>}}</w:t>
+              <w:t>{{paraf_12}}</w:t>
             </w:r>
           </w:p>
         </w:tc>
@@ -2445,19 +2293,7 @@
               <w:rPr>
                 <w:lang w:val="en-US"/>
               </w:rPr>
-              <w:t>{{tanggal_1</w:t>
-            </w:r>
-            <w:r>
-              <w:rPr>
-                <w:lang w:val="en-US"/>
-              </w:rPr>
-              <w:t>3</w:t>
-            </w:r>
-            <w:r>
-              <w:rPr>
-                <w:lang w:val="en-US"/>
-              </w:rPr>
-              <w:t>}}</w:t>
+              <w:t>{{tanggal_13}}</w:t>
             </w:r>
           </w:p>
         </w:tc>
@@ -2477,19 +2313,7 @@
               <w:rPr>
                 <w:lang w:val="en-US"/>
               </w:rPr>
-              <w:t>{{keterangan_1</w:t>
-            </w:r>
-            <w:r>
-              <w:rPr>
-                <w:lang w:val="en-US"/>
-              </w:rPr>
-              <w:t>3</w:t>
-            </w:r>
-            <w:r>
-              <w:rPr>
-                <w:lang w:val="en-US"/>
-              </w:rPr>
-              <w:t>}}</w:t>
+              <w:t>{{keterangan_13}}</w:t>
             </w:r>
           </w:p>
         </w:tc>
@@ -2509,19 +2333,7 @@
               <w:rPr>
                 <w:lang w:val="en-US"/>
               </w:rPr>
-              <w:t>{{paraf_1</w:t>
-            </w:r>
-            <w:r>
-              <w:rPr>
-                <w:lang w:val="en-US"/>
-              </w:rPr>
-              <w:t>3</w:t>
-            </w:r>
-            <w:r>
-              <w:rPr>
-                <w:lang w:val="en-US"/>
-              </w:rPr>
-              <w:t>}}</w:t>
+              <w:t>{{paraf_13}}</w:t>
             </w:r>
           </w:p>
         </w:tc>
@@ -2546,19 +2358,7 @@
               <w:rPr>
                 <w:lang w:val="en-US"/>
               </w:rPr>
-              <w:t>{{tanggal_1</w:t>
-            </w:r>
-            <w:r>
-              <w:rPr>
-                <w:lang w:val="en-US"/>
-              </w:rPr>
-              <w:t>4</w:t>
-            </w:r>
-            <w:r>
-              <w:rPr>
-                <w:lang w:val="en-US"/>
-              </w:rPr>
-              <w:t>}}</w:t>
+              <w:t>{{tanggal_14}}</w:t>
             </w:r>
           </w:p>
         </w:tc>
@@ -2578,19 +2378,7 @@
               <w:rPr>
                 <w:lang w:val="en-US"/>
               </w:rPr>
-              <w:t>{{keterangan_1</w:t>
-            </w:r>
-            <w:r>
-              <w:rPr>
-                <w:lang w:val="en-US"/>
-              </w:rPr>
-              <w:t>4</w:t>
-            </w:r>
-            <w:r>
-              <w:rPr>
-                <w:lang w:val="en-US"/>
-              </w:rPr>
-              <w:t>}}</w:t>
+              <w:t>{{keterangan_14}}</w:t>
             </w:r>
           </w:p>
         </w:tc>
@@ -2610,19 +2398,7 @@
               <w:rPr>
                 <w:lang w:val="en-US"/>
               </w:rPr>
-              <w:t>{{paraf_1</w:t>
-            </w:r>
-            <w:r>
-              <w:rPr>
-                <w:lang w:val="en-US"/>
-              </w:rPr>
-              <w:t>4</w:t>
-            </w:r>
-            <w:r>
-              <w:rPr>
-                <w:lang w:val="en-US"/>
-              </w:rPr>
-              <w:t>}}</w:t>
+              <w:t>{{paraf_14}}</w:t>
             </w:r>
           </w:p>
         </w:tc>
@@ -2647,19 +2423,7 @@
               <w:rPr>
                 <w:lang w:val="en-US"/>
               </w:rPr>
-              <w:t>{{tanggal_1</w:t>
-            </w:r>
-            <w:r>
-              <w:rPr>
-                <w:lang w:val="en-US"/>
-              </w:rPr>
-              <w:t>5</w:t>
-            </w:r>
-            <w:r>
-              <w:rPr>
-                <w:lang w:val="en-US"/>
-              </w:rPr>
-              <w:t>}}</w:t>
+              <w:t>{{tanggal_15}}</w:t>
             </w:r>
           </w:p>
         </w:tc>
@@ -2679,19 +2443,7 @@
               <w:rPr>
                 <w:lang w:val="en-US"/>
               </w:rPr>
-              <w:t>{{keterangan_1</w:t>
-            </w:r>
-            <w:r>
-              <w:rPr>
-                <w:lang w:val="en-US"/>
-              </w:rPr>
-              <w:t>5</w:t>
-            </w:r>
-            <w:r>
-              <w:rPr>
-                <w:lang w:val="en-US"/>
-              </w:rPr>
-              <w:t>}}</w:t>
+              <w:t>{{keterangan_15}}</w:t>
             </w:r>
           </w:p>
         </w:tc>
@@ -2711,19 +2463,7 @@
               <w:rPr>
                 <w:lang w:val="en-US"/>
               </w:rPr>
-              <w:t>{{paraf_1</w:t>
-            </w:r>
-            <w:r>
-              <w:rPr>
-                <w:lang w:val="en-US"/>
-              </w:rPr>
-              <w:t>5</w:t>
-            </w:r>
-            <w:r>
-              <w:rPr>
-                <w:lang w:val="en-US"/>
-              </w:rPr>
-              <w:t>}}</w:t>
+              <w:t>{{paraf_15}}</w:t>
             </w:r>
           </w:p>
         </w:tc>
@@ -2748,19 +2488,7 @@
               <w:rPr>
                 <w:lang w:val="en-US"/>
               </w:rPr>
-              <w:t>{{tanggal_1</w:t>
-            </w:r>
-            <w:r>
-              <w:rPr>
-                <w:lang w:val="en-US"/>
-              </w:rPr>
-              <w:t>6</w:t>
-            </w:r>
-            <w:r>
-              <w:rPr>
-                <w:lang w:val="en-US"/>
-              </w:rPr>
-              <w:t>}}</w:t>
+              <w:t>{{tanggal_16}}</w:t>
             </w:r>
           </w:p>
         </w:tc>
@@ -2780,19 +2508,7 @@
               <w:rPr>
                 <w:lang w:val="en-US"/>
               </w:rPr>
-              <w:t>{{keterangan_1</w:t>
-            </w:r>
-            <w:r>
-              <w:rPr>
-                <w:lang w:val="en-US"/>
-              </w:rPr>
-              <w:t>6</w:t>
-            </w:r>
-            <w:r>
-              <w:rPr>
-                <w:lang w:val="en-US"/>
-              </w:rPr>
-              <w:t>}}</w:t>
+              <w:t>{{keterangan_16}}</w:t>
             </w:r>
           </w:p>
         </w:tc>
@@ -2812,19 +2528,7 @@
               <w:rPr>
                 <w:lang w:val="en-US"/>
               </w:rPr>
-              <w:t>{{paraf_1</w:t>
-            </w:r>
-            <w:r>
-              <w:rPr>
-                <w:lang w:val="en-US"/>
-              </w:rPr>
-              <w:t>6</w:t>
-            </w:r>
-            <w:r>
-              <w:rPr>
-                <w:lang w:val="en-US"/>
-              </w:rPr>
-              <w:t>}}</w:t>
+              <w:t>{{paraf_16}}</w:t>
             </w:r>
           </w:p>
         </w:tc>
@@ -2849,19 +2553,7 @@
               <w:rPr>
                 <w:lang w:val="en-US"/>
               </w:rPr>
-              <w:t>{{tanggal_1</w:t>
-            </w:r>
-            <w:r>
-              <w:rPr>
-                <w:lang w:val="en-US"/>
-              </w:rPr>
-              <w:t>7</w:t>
-            </w:r>
-            <w:r>
-              <w:rPr>
-                <w:lang w:val="en-US"/>
-              </w:rPr>
-              <w:t>}}</w:t>
+              <w:t>{{tanggal_17}}</w:t>
             </w:r>
           </w:p>
         </w:tc>
@@ -2881,19 +2573,7 @@
               <w:rPr>
                 <w:lang w:val="en-US"/>
               </w:rPr>
-              <w:t>{{keterangan_1</w:t>
-            </w:r>
-            <w:r>
-              <w:rPr>
-                <w:lang w:val="en-US"/>
-              </w:rPr>
-              <w:t>7</w:t>
-            </w:r>
-            <w:r>
-              <w:rPr>
-                <w:lang w:val="en-US"/>
-              </w:rPr>
-              <w:t>}}</w:t>
+              <w:t>{{keterangan_17}}</w:t>
             </w:r>
           </w:p>
         </w:tc>
@@ -2913,19 +2593,7 @@
               <w:rPr>
                 <w:lang w:val="en-US"/>
               </w:rPr>
-              <w:t>{{paraf_1</w:t>
-            </w:r>
-            <w:r>
-              <w:rPr>
-                <w:lang w:val="en-US"/>
-              </w:rPr>
-              <w:t>7</w:t>
-            </w:r>
-            <w:r>
-              <w:rPr>
-                <w:lang w:val="en-US"/>
-              </w:rPr>
-              <w:t>}}</w:t>
+              <w:t>{{paraf_17}}</w:t>
             </w:r>
           </w:p>
         </w:tc>
@@ -2950,19 +2618,7 @@
               <w:rPr>
                 <w:lang w:val="en-US"/>
               </w:rPr>
-              <w:t>{{tanggal_1</w:t>
-            </w:r>
-            <w:r>
-              <w:rPr>
-                <w:lang w:val="en-US"/>
-              </w:rPr>
-              <w:t>8</w:t>
-            </w:r>
-            <w:r>
-              <w:rPr>
-                <w:lang w:val="en-US"/>
-              </w:rPr>
-              <w:t>}}</w:t>
+              <w:t>{{tanggal_18}}</w:t>
             </w:r>
           </w:p>
         </w:tc>
@@ -2982,19 +2638,7 @@
               <w:rPr>
                 <w:lang w:val="en-US"/>
               </w:rPr>
-              <w:t>{{keterangan_1</w:t>
-            </w:r>
-            <w:r>
-              <w:rPr>
-                <w:lang w:val="en-US"/>
-              </w:rPr>
-              <w:t>8</w:t>
-            </w:r>
-            <w:r>
-              <w:rPr>
-                <w:lang w:val="en-US"/>
-              </w:rPr>
-              <w:t>}}</w:t>
+              <w:t>{{keterangan_18}}</w:t>
             </w:r>
           </w:p>
         </w:tc>
@@ -3014,19 +2658,7 @@
               <w:rPr>
                 <w:lang w:val="en-US"/>
               </w:rPr>
-              <w:t>{{paraf_1</w:t>
-            </w:r>
-            <w:r>
-              <w:rPr>
-                <w:lang w:val="en-US"/>
-              </w:rPr>
-              <w:t>8</w:t>
-            </w:r>
-            <w:r>
-              <w:rPr>
-                <w:lang w:val="en-US"/>
-              </w:rPr>
-              <w:t>}}</w:t>
+              <w:t>{{paraf_18}}</w:t>
             </w:r>
           </w:p>
         </w:tc>

</xml_diff>